<commit_message>
Archive Zittingslijsten-Workflow.docx from rechtzaak: Workflow handover, single straight-through process from upload to download
</commit_message>
<xml_diff>
--- a/projects/rechtzaak/docs/Zittingslijsten-Workflow.docx
+++ b/projects/rechtzaak/docs/Zittingslijsten-Workflow.docx
@@ -42,7 +42,7 @@
         <w:pStyle w:val="FirstParagraph"/>
       </w:pPr>
       <w:r>
-        <w:t xml:space="preserve">Document-centric workflow from upload to download. The diagram below shows the happy path with the rejection branch; numbered steps under "Status transitions" map directly to HTTP endpoints in the app.</w:t>
+        <w:t xml:space="preserve">Document-centric workflow from upload to download. The application has a single straight-through process — no review, no approval steps, no rejection branch. The diagram below shows the full path; numbered steps map directly to HTTP endpoints in the app.</w:t>
       </w:r>
     </w:p>
     <w:bookmarkStart w:id="12" w:name="sequence-diagram"/>
@@ -61,7 +61,7 @@
       <w:r>
         <w:drawing>
           <wp:inline>
-            <wp:extent cx="5334000" cy="6479822"/>
+            <wp:extent cx="5334000" cy="7332784"/>
             <wp:effectExtent b="0" l="0" r="0" t="0"/>
             <wp:docPr descr="Zittingslijsten sequence" title="" id="10" name="Picture"/>
             <a:graphic>
@@ -82,7 +82,7 @@
                   <pic:spPr bwMode="auto">
                     <a:xfrm>
                       <a:off x="0" y="0"/>
-                      <a:ext cx="5334000" cy="6479822"/>
+                      <a:ext cx="5334000" cy="7332784"/>
                     </a:xfrm>
                     <a:prstGeom prst="rect">
                       <a:avLst/>
@@ -102,13 +102,13 @@
       </w:r>
     </w:p>
     <w:bookmarkEnd w:id="12"/>
-    <w:bookmarkStart w:id="13" w:name="actors"/>
+    <w:bookmarkStart w:id="13" w:name="roles"/>
     <w:p>
       <w:pPr>
         <w:pStyle w:val="Heading2"/>
       </w:pPr>
       <w:r>
-        <w:t xml:space="preserve">Actors</w:t>
+        <w:t xml:space="preserve">Roles</w:t>
       </w:r>
     </w:p>
     <w:tbl>
@@ -132,7 +132,7 @@
               <w:pStyle w:val="Compact"/>
             </w:pPr>
             <w:r>
-              <w:t xml:space="preserve">Actor</w:t>
+              <w:t xml:space="preserve">Role</w:t>
             </w:r>
           </w:p>
         </w:tc>
@@ -143,43 +143,7 @@
               <w:pStyle w:val="Compact"/>
             </w:pPr>
             <w:r>
-              <w:t xml:space="preserve">Application role</w:t>
-            </w:r>
-          </w:p>
-        </w:tc>
-      </w:tr>
-      <w:tr>
-        <w:tc>
-          <w:tcPr/>
-          <w:p>
-            <w:pPr>
-              <w:pStyle w:val="Compact"/>
-            </w:pPr>
-            <w:r>
-              <w:t xml:space="preserve">Uploader</w:t>
-            </w:r>
-          </w:p>
-        </w:tc>
-        <w:tc>
-          <w:tcPr/>
-          <w:p>
-            <w:pPr>
-              <w:pStyle w:val="Compact"/>
-            </w:pPr>
-            <w:r>
-              <w:t xml:space="preserve">Any logged-in Specialist who drops the perslijst PDF into</w:t>
-            </w:r>
-            <w:r>
-              <w:t xml:space="preserve"> </w:t>
-            </w:r>
-            <w:r>
-              <w:rPr>
-                <w:rStyle w:val="VerbatimChar"/>
-              </w:rPr>
-              <w:t xml:space="preserve">/documenten</w:t>
-            </w:r>
-            <w:r>
-              <w:t xml:space="preserve">.</w:t>
+              <w:t xml:space="preserve">What they can do</w:t>
             </w:r>
           </w:p>
         </w:tc>
@@ -203,55 +167,7 @@
               <w:pStyle w:val="Compact"/>
             </w:pPr>
             <w:r>
-              <w:t xml:space="preserve">The user who picks up a document from the queue and edits the zaken.</w:t>
-            </w:r>
-          </w:p>
-        </w:tc>
-      </w:tr>
-      <w:tr>
-        <w:tc>
-          <w:tcPr/>
-          <w:p>
-            <w:pPr>
-              <w:pStyle w:val="Compact"/>
-            </w:pPr>
-            <w:r>
-              <w:t xml:space="preserve">Reviewer</w:t>
-            </w:r>
-          </w:p>
-        </w:tc>
-        <w:tc>
-          <w:tcPr/>
-          <w:p>
-            <w:pPr>
-              <w:pStyle w:val="Compact"/>
-            </w:pPr>
-            <w:r>
-              <w:t xml:space="preserve">A second Specialist who does the eerste beoordeling (R1).</w:t>
-            </w:r>
-          </w:p>
-        </w:tc>
-      </w:tr>
-      <w:tr>
-        <w:tc>
-          <w:tcPr/>
-          <w:p>
-            <w:pPr>
-              <w:pStyle w:val="Compact"/>
-            </w:pPr>
-            <w:r>
-              <w:t xml:space="preserve">Final reviewer</w:t>
-            </w:r>
-          </w:p>
-        </w:tc>
-        <w:tc>
-          <w:tcPr/>
-          <w:p>
-            <w:pPr>
-              <w:pStyle w:val="Compact"/>
-            </w:pPr>
-            <w:r>
-              <w:t xml:space="preserve">A third Specialist who does the eindbeoordeling (R2). Often the same person as a Reviewer; the system enforces that it cannot be the original Specialist.</w:t>
+              <w:t xml:space="preserve">Upload perslijst PDFs, claim documents from the queue, fill in zaken, mark as klaar, download.</w:t>
             </w:r>
           </w:p>
         </w:tc>
@@ -275,22 +191,7 @@
               <w:pStyle w:val="Compact"/>
             </w:pPr>
             <w:r>
-              <w:t xml:space="preserve">Not in the diagram — has cross-cutting</w:t>
-            </w:r>
-            <w:r>
-              <w:t xml:space="preserve"> </w:t>
-            </w:r>
-            <w:r>
-              <w:rPr>
-                <w:rStyle w:val="VerbatimChar"/>
-              </w:rPr>
-              <w:t xml:space="preserve">delete</w:t>
-            </w:r>
-            <w:r>
-              <w:t xml:space="preserve"> </w:t>
-            </w:r>
-            <w:r>
-              <w:t xml:space="preserve">rights and read access to the audit log.</w:t>
+              <w:t xml:space="preserve">Everything a Specialist can do, plus delete any zaak or perslijst and read the audit log.</w:t>
             </w:r>
           </w:p>
         </w:tc>
@@ -445,7 +346,7 @@
               <w:rPr>
                 <w:rStyle w:val="VerbatimChar"/>
               </w:rPr>
-              <w:t xml:space="preserve">EERSTE_BEOORDELING</w:t>
+              <w:t xml:space="preserve">KLAAR</w:t>
             </w:r>
           </w:p>
         </w:tc>
@@ -456,7 +357,7 @@
               <w:pStyle w:val="Compact"/>
             </w:pPr>
             <w:r>
-              <w:t xml:space="preserve">All zaken complete; sent for review.</w:t>
+              <w:t xml:space="preserve">All zaken in scope; the document is exportable.</w:t>
             </w:r>
           </w:p>
         </w:tc>
@@ -470,147 +371,29 @@
               <w:rPr>
                 <w:rStyle w:val="VerbatimChar"/>
               </w:rPr>
-              <w:t xml:space="preserve">POST /documenten/{id}/submit</w:t>
-            </w:r>
-          </w:p>
-        </w:tc>
-      </w:tr>
-      <w:tr>
-        <w:tc>
-          <w:tcPr/>
-          <w:p>
-            <w:pPr>
-              <w:pStyle w:val="Compact"/>
-            </w:pPr>
-            <w:r>
-              <w:rPr>
-                <w:rStyle w:val="VerbatimChar"/>
-              </w:rPr>
-              <w:t xml:space="preserve">EINDBEOORDELING</w:t>
-            </w:r>
-          </w:p>
-        </w:tc>
-        <w:tc>
-          <w:tcPr/>
-          <w:p>
-            <w:pPr>
-              <w:pStyle w:val="Compact"/>
-            </w:pPr>
-            <w:r>
-              <w:t xml:space="preserve">Reviewer approved; sent for final approval.</w:t>
-            </w:r>
-          </w:p>
-        </w:tc>
-        <w:tc>
-          <w:tcPr/>
-          <w:p>
-            <w:pPr>
-              <w:pStyle w:val="Compact"/>
-            </w:pPr>
-            <w:r>
-              <w:rPr>
-                <w:rStyle w:val="VerbatimChar"/>
-              </w:rPr>
-              <w:t xml:space="preserve">POST /documenten/{id}/approve</w:t>
-            </w:r>
-            <w:r>
-              <w:t xml:space="preserve"> </w:t>
-            </w:r>
-            <w:r>
-              <w:t xml:space="preserve">(R1)</w:t>
-            </w:r>
-          </w:p>
-        </w:tc>
-      </w:tr>
-      <w:tr>
-        <w:tc>
-          <w:tcPr/>
-          <w:p>
-            <w:pPr>
-              <w:pStyle w:val="Compact"/>
-            </w:pPr>
-            <w:r>
-              <w:rPr>
-                <w:rStyle w:val="VerbatimChar"/>
-              </w:rPr>
-              <w:t xml:space="preserve">AFGEKEURD</w:t>
-            </w:r>
-          </w:p>
-        </w:tc>
-        <w:tc>
-          <w:tcPr/>
-          <w:p>
-            <w:pPr>
-              <w:pStyle w:val="Compact"/>
-            </w:pPr>
-            <w:r>
-              <w:t xml:space="preserve">Reviewer rejected; goes back to the original Specialist.</w:t>
-            </w:r>
-          </w:p>
-        </w:tc>
-        <w:tc>
-          <w:tcPr/>
-          <w:p>
-            <w:pPr>
-              <w:pStyle w:val="Compact"/>
-            </w:pPr>
-            <w:r>
-              <w:rPr>
-                <w:rStyle w:val="VerbatimChar"/>
-              </w:rPr>
-              <w:t xml:space="preserve">POST /documenten/{id}/reject</w:t>
-            </w:r>
-          </w:p>
-        </w:tc>
-      </w:tr>
-      <w:tr>
-        <w:tc>
-          <w:tcPr/>
-          <w:p>
-            <w:pPr>
-              <w:pStyle w:val="Compact"/>
-            </w:pPr>
-            <w:r>
-              <w:rPr>
-                <w:rStyle w:val="VerbatimChar"/>
-              </w:rPr>
-              <w:t xml:space="preserve">KLAAR</w:t>
-            </w:r>
-          </w:p>
-        </w:tc>
-        <w:tc>
-          <w:tcPr/>
-          <w:p>
-            <w:pPr>
-              <w:pStyle w:val="Compact"/>
-            </w:pPr>
-            <w:r>
-              <w:t xml:space="preserve">Final approval; document is exportable.</w:t>
-            </w:r>
-          </w:p>
-        </w:tc>
-        <w:tc>
-          <w:tcPr/>
-          <w:p>
-            <w:pPr>
-              <w:pStyle w:val="Compact"/>
-            </w:pPr>
-            <w:r>
-              <w:rPr>
-                <w:rStyle w:val="VerbatimChar"/>
-              </w:rPr>
-              <w:t xml:space="preserve">POST /documenten/{id}/approve</w:t>
-            </w:r>
-            <w:r>
-              <w:t xml:space="preserve"> </w:t>
-            </w:r>
-            <w:r>
-              <w:t xml:space="preserve">(R2)</w:t>
+              <w:t xml:space="preserve">POST /documenten/{id}/finalize</w:t>
             </w:r>
           </w:p>
         </w:tc>
       </w:tr>
     </w:tbl>
+    <w:p>
+      <w:pPr>
+        <w:pStyle w:val="BodyText"/>
+      </w:pPr>
+      <w:r>
+        <w:rPr>
+          <w:rStyle w:val="VerbatimChar"/>
+        </w:rPr>
+        <w:t xml:space="preserve">KLAAR</w:t>
+      </w:r>
+      <w:r>
+        <w:t xml:space="preserve"> </w:t>
+      </w:r>
+      <w:r>
+        <w:t xml:space="preserve">is terminal. To re-open a finalized document, an Admin would currently need to flip the status manually in the database — by design.</w:t>
+      </w:r>
+    </w:p>
     <w:bookmarkEnd w:id="14"/>
     <w:bookmarkStart w:id="15" w:name="per-zaak-save-loop"/>
     <w:p>
@@ -936,13 +719,13 @@
       </w:r>
     </w:p>
     <w:bookmarkEnd w:id="15"/>
-    <w:bookmarkStart w:id="16" w:name="rejection-branch"/>
+    <w:bookmarkStart w:id="16" w:name="finalize"/>
     <w:p>
       <w:pPr>
         <w:pStyle w:val="Heading2"/>
       </w:pPr>
       <w:r>
-        <w:t xml:space="preserve">Rejection branch</w:t>
+        <w:t xml:space="preserve">Finalize</w:t>
       </w:r>
     </w:p>
     <w:p>
@@ -950,7 +733,19 @@
         <w:pStyle w:val="FirstParagraph"/>
       </w:pPr>
       <w:r>
-        <w:t xml:space="preserve">When a reviewer clicks</w:t>
+        <w:t xml:space="preserve">Once all zaken in the document are filled in (the progress bar reads</w:t>
+      </w:r>
+      <w:r>
+        <w:t xml:space="preserve"> </w:t>
+      </w:r>
+      <w:r>
+        <w:rPr>
+          <w:rStyle w:val="VerbatimChar"/>
+        </w:rPr>
+        <w:t xml:space="preserve">N / N zaken gereed</w:t>
+      </w:r>
+      <w:r>
+        <w:t xml:space="preserve">), the Specialist clicks</w:t>
       </w:r>
       <w:r>
         <w:t xml:space="preserve"> </w:t>
@@ -960,10 +755,10 @@
           <w:b/>
           <w:bCs/>
         </w:rPr>
-        <w:t xml:space="preserve">Afkeuren</w:t>
-      </w:r>
-      <w:r>
-        <w:t xml:space="preserve">, the app collects:</w:t>
+        <w:t xml:space="preserve">Markeer als klaar</w:t>
+      </w:r>
+      <w:r>
+        <w:t xml:space="preserve">. The handler:</w:t>
       </w:r>
     </w:p>
     <w:p>
@@ -975,55 +770,46 @@
         </w:numPr>
       </w:pPr>
       <w:r>
-        <w:rPr>
-          <w:rStyle w:val="VerbatimChar"/>
-        </w:rPr>
-        <w:t xml:space="preserve">rejection_category</w:t>
-      </w:r>
-      <w:r>
-        <w:t xml:space="preserve"> </w:t>
-      </w:r>
-      <w:r>
-        <w:t xml:space="preserve">(a fixed list, e.g.</w:t>
-      </w:r>
-      <w:r>
-        <w:t xml:space="preserve"> </w:t>
-      </w:r>
-      <w:r>
-        <w:rPr>
-          <w:i/>
-          <w:iCs/>
-        </w:rPr>
-        <w:t xml:space="preserve">missing data</w:t>
-      </w:r>
-      <w:r>
-        <w:t xml:space="preserve">,</w:t>
-      </w:r>
-      <w:r>
-        <w:t xml:space="preserve"> </w:t>
-      </w:r>
-      <w:r>
-        <w:rPr>
-          <w:i/>
-          <w:iCs/>
-        </w:rPr>
-        <w:t xml:space="preserve">wrong court</w:t>
-      </w:r>
-      <w:r>
-        <w:t xml:space="preserve">,</w:t>
-      </w:r>
-      <w:r>
-        <w:t xml:space="preserve"> </w:t>
-      </w:r>
-      <w:r>
-        <w:rPr>
-          <w:i/>
-          <w:iCs/>
-        </w:rPr>
-        <w:t xml:space="preserve">style</w:t>
-      </w:r>
-      <w:r>
-        <w:t xml:space="preserve">),</w:t>
+        <w:t xml:space="preserve">Updates</w:t>
+      </w:r>
+      <w:r>
+        <w:t xml:space="preserve"> </w:t>
+      </w:r>
+      <w:r>
+        <w:rPr>
+          <w:rStyle w:val="VerbatimChar"/>
+        </w:rPr>
+        <w:t xml:space="preserve">documents.status = 'KLAAR'</w:t>
+      </w:r>
+      <w:r>
+        <w:t xml:space="preserve">, sets</w:t>
+      </w:r>
+      <w:r>
+        <w:t xml:space="preserve"> </w:t>
+      </w:r>
+      <w:r>
+        <w:rPr>
+          <w:rStyle w:val="VerbatimChar"/>
+        </w:rPr>
+        <w:t xml:space="preserve">approved_by</w:t>
+      </w:r>
+      <w:r>
+        <w:t xml:space="preserve"> </w:t>
+      </w:r>
+      <w:r>
+        <w:t xml:space="preserve">and</w:t>
+      </w:r>
+      <w:r>
+        <w:t xml:space="preserve"> </w:t>
+      </w:r>
+      <w:r>
+        <w:rPr>
+          <w:rStyle w:val="VerbatimChar"/>
+        </w:rPr>
+        <w:t xml:space="preserve">approved_at</w:t>
+      </w:r>
+      <w:r>
+        <w:t xml:space="preserve">.</w:t>
       </w:r>
     </w:p>
     <w:p>
@@ -1035,16 +821,56 @@
         </w:numPr>
       </w:pPr>
       <w:r>
-        <w:rPr>
-          <w:rStyle w:val="VerbatimChar"/>
-        </w:rPr>
-        <w:t xml:space="preserve">rejection_notes</w:t>
-      </w:r>
-      <w:r>
-        <w:t xml:space="preserve"> </w:t>
-      </w:r>
-      <w:r>
-        <w:t xml:space="preserve">(free text),</w:t>
+        <w:t xml:space="preserve">Writes an</w:t>
+      </w:r>
+      <w:r>
+        <w:t xml:space="preserve"> </w:t>
+      </w:r>
+      <w:r>
+        <w:rPr>
+          <w:rStyle w:val="VerbatimChar"/>
+        </w:rPr>
+        <w:t xml:space="preserve">audit_log</w:t>
+      </w:r>
+      <w:r>
+        <w:t xml:space="preserve"> </w:t>
+      </w:r>
+      <w:r>
+        <w:t xml:space="preserve">entry with action</w:t>
+      </w:r>
+      <w:r>
+        <w:t xml:space="preserve"> </w:t>
+      </w:r>
+      <w:r>
+        <w:rPr>
+          <w:rStyle w:val="VerbatimChar"/>
+        </w:rPr>
+        <w:t xml:space="preserve">DOCUMENT_FINALIZE</w:t>
+      </w:r>
+      <w:r>
+        <w:t xml:space="preserve">.</w:t>
+      </w:r>
+    </w:p>
+    <w:p>
+      <w:pPr>
+        <w:pStyle w:val="Compact"/>
+        <w:numPr>
+          <w:ilvl w:val="0"/>
+          <w:numId w:val="1003"/>
+        </w:numPr>
+      </w:pPr>
+      <w:r>
+        <w:t xml:space="preserve">Redirects back to the editor; the toolbar collapses to the green-check status indicator.</w:t>
+      </w:r>
+    </w:p>
+    <w:bookmarkEnd w:id="16"/>
+    <w:bookmarkStart w:id="17" w:name="download"/>
+    <w:p>
+      <w:pPr>
+        <w:pStyle w:val="Heading2"/>
+      </w:pPr>
+      <w:r>
+        <w:t xml:space="preserve">Download</w:t>
       </w:r>
     </w:p>
     <w:p>
@@ -1052,76 +878,19 @@
         <w:pStyle w:val="FirstParagraph"/>
       </w:pPr>
       <w:r>
-        <w:t xml:space="preserve">stores them on the document, sets</w:t>
-      </w:r>
-      <w:r>
-        <w:t xml:space="preserve"> </w:t>
-      </w:r>
-      <w:r>
-        <w:rPr>
-          <w:rStyle w:val="VerbatimChar"/>
-        </w:rPr>
-        <w:t xml:space="preserve">rejected_by</w:t>
-      </w:r>
-      <w:r>
-        <w:t xml:space="preserve"> </w:t>
-      </w:r>
-      <w:r>
-        <w:t xml:space="preserve">/</w:t>
-      </w:r>
-      <w:r>
-        <w:t xml:space="preserve"> </w:t>
-      </w:r>
-      <w:r>
-        <w:rPr>
-          <w:rStyle w:val="VerbatimChar"/>
-        </w:rPr>
-        <w:t xml:space="preserve">rejected_at</w:t>
-      </w:r>
-      <w:r>
-        <w:t xml:space="preserve">, and flips</w:t>
-      </w:r>
-      <w:r>
-        <w:t xml:space="preserve"> </w:t>
-      </w:r>
-      <w:r>
-        <w:rPr>
-          <w:rStyle w:val="VerbatimChar"/>
-        </w:rPr>
-        <w:t xml:space="preserve">status</w:t>
-      </w:r>
-      <w:r>
-        <w:t xml:space="preserve"> </w:t>
-      </w:r>
-      <w:r>
-        <w:t xml:space="preserve">back to</w:t>
-      </w:r>
-      <w:r>
-        <w:t xml:space="preserve"> </w:t>
-      </w:r>
-      <w:r>
-        <w:rPr>
-          <w:rStyle w:val="VerbatimChar"/>
-        </w:rPr>
-        <w:t xml:space="preserve">IN_BEHANDELING</w:t>
-      </w:r>
-      <w:r>
-        <w:t xml:space="preserve"> </w:t>
-      </w:r>
-      <w:r>
-        <w:t xml:space="preserve">while keeping the original</w:t>
-      </w:r>
-      <w:r>
-        <w:t xml:space="preserve"> </w:t>
-      </w:r>
-      <w:r>
-        <w:rPr>
-          <w:rStyle w:val="VerbatimChar"/>
-        </w:rPr>
-        <w:t xml:space="preserve">assigned_to</w:t>
-      </w:r>
-      <w:r>
-        <w:t xml:space="preserve">. The Specialist sees the rejection reason at the top of the editor and resubmits when fixed (the</w:t>
+        <w:t xml:space="preserve">Once</w:t>
+      </w:r>
+      <w:r>
+        <w:t xml:space="preserve"> </w:t>
+      </w:r>
+      <w:r>
+        <w:rPr>
+          <w:rStyle w:val="VerbatimChar"/>
+        </w:rPr>
+        <w:t xml:space="preserve">status = KLAAR</w:t>
+      </w:r>
+      <w:r>
+        <w:t xml:space="preserve">, the</w:t>
       </w:r>
       <w:r>
         <w:t xml:space="preserve"> </w:t>
@@ -1131,56 +900,25 @@
           <w:b/>
           <w:bCs/>
         </w:rPr>
-        <w:t xml:space="preserve">Verzenden voor beoordeling</w:t>
-      </w:r>
-      <w:r>
-        <w:t xml:space="preserve"> </w:t>
-      </w:r>
-      <w:r>
-        <w:t xml:space="preserve">button is back).</w:t>
-      </w:r>
-    </w:p>
-    <w:bookmarkEnd w:id="16"/>
-    <w:bookmarkStart w:id="17" w:name="download"/>
-    <w:p>
-      <w:pPr>
-        <w:pStyle w:val="Heading2"/>
-      </w:pPr>
-      <w:r>
         <w:t xml:space="preserve">Download</w:t>
       </w:r>
-    </w:p>
-    <w:p>
-      <w:pPr>
-        <w:pStyle w:val="FirstParagraph"/>
-      </w:pPr>
-      <w:r>
-        <w:t xml:space="preserve">Once</w:t>
-      </w:r>
-      <w:r>
-        <w:t xml:space="preserve"> </w:t>
-      </w:r>
-      <w:r>
-        <w:rPr>
-          <w:rStyle w:val="VerbatimChar"/>
-        </w:rPr>
-        <w:t xml:space="preserve">status = KLAAR</w:t>
-      </w:r>
-      <w:r>
-        <w:t xml:space="preserve">, anyone with read access can click</w:t>
-      </w:r>
-      <w:r>
-        <w:t xml:space="preserve"> </w:t>
-      </w:r>
-      <w:r>
-        <w:rPr>
-          <w:b/>
-          <w:bCs/>
-        </w:rPr>
-        <w:t xml:space="preserve">Download</w:t>
-      </w:r>
-      <w:r>
-        <w:t xml:space="preserve">:</w:t>
+      <w:r>
+        <w:t xml:space="preserve"> </w:t>
+      </w:r>
+      <w:r>
+        <w:t xml:space="preserve">button is the row's primary action on</w:t>
+      </w:r>
+      <w:r>
+        <w:t xml:space="preserve"> </w:t>
+      </w:r>
+      <w:r>
+        <w:rPr>
+          <w:rStyle w:val="VerbatimChar"/>
+        </w:rPr>
+        <w:t xml:space="preserve">/documenten</w:t>
+      </w:r>
+      <w:r>
+        <w:t xml:space="preserve">. It opens an export modal with two formats:</w:t>
       </w:r>
     </w:p>
     <w:p>
@@ -1192,15 +930,9 @@
         </w:numPr>
       </w:pPr>
       <w:r>
-        <w:t xml:space="preserve">The Download button opens an export modal with two formats:</w:t>
-      </w:r>
-      <w:r>
-        <w:t xml:space="preserve"> </w:t>
-      </w:r>
-      <w:r>
-        <w:rPr>
-          <w:i/>
-          <w:iCs/>
+        <w:rPr>
+          <w:b/>
+          <w:bCs/>
         </w:rPr>
         <w:t xml:space="preserve">Normale output</w:t>
       </w:r>
@@ -1208,23 +940,7 @@
         <w:t xml:space="preserve"> </w:t>
       </w:r>
       <w:r>
-        <w:t xml:space="preserve">(legacy form layout) and</w:t>
-      </w:r>
-      <w:r>
-        <w:t xml:space="preserve"> </w:t>
-      </w:r>
-      <w:r>
-        <w:rPr>
-          <w:i/>
-          <w:iCs/>
-        </w:rPr>
-        <w:t xml:space="preserve">Zittingslijst</w:t>
-      </w:r>
-      <w:r>
-        <w:t xml:space="preserve"> </w:t>
-      </w:r>
-      <w:r>
-        <w:t xml:space="preserve">(the canonical card layout).</w:t>
+        <w:t xml:space="preserve">— legacy form layout PDF.</w:t>
       </w:r>
     </w:p>
     <w:p>
@@ -1236,61 +952,79 @@
         </w:numPr>
       </w:pPr>
       <w:r>
-        <w:t xml:space="preserve">The chosen renderer queries</w:t>
-      </w:r>
-      <w:r>
-        <w:t xml:space="preserve"> </w:t>
-      </w:r>
-      <w:r>
-        <w:rPr>
-          <w:rStyle w:val="VerbatimChar"/>
-        </w:rPr>
-        <w:t xml:space="preserve">documents</w:t>
-      </w:r>
-      <w:r>
-        <w:t xml:space="preserve"> </w:t>
-      </w:r>
-      <w:r>
-        <w:t xml:space="preserve">+</w:t>
-      </w:r>
-      <w:r>
-        <w:t xml:space="preserve"> </w:t>
-      </w:r>
-      <w:r>
-        <w:rPr>
-          <w:rStyle w:val="VerbatimChar"/>
-        </w:rPr>
-        <w:t xml:space="preserve">zaken</w:t>
-      </w:r>
-      <w:r>
-        <w:t xml:space="preserve"> </w:t>
-      </w:r>
-      <w:r>
-        <w:t xml:space="preserve">and streams a generated PDF; the source PDF in</w:t>
-      </w:r>
-      <w:r>
-        <w:t xml:space="preserve"> </w:t>
-      </w:r>
-      <w:r>
-        <w:rPr>
-          <w:rStyle w:val="VerbatimChar"/>
-        </w:rPr>
-        <w:t xml:space="preserve">file_data</w:t>
-      </w:r>
-      <w:r>
-        <w:t xml:space="preserve"> </w:t>
-      </w:r>
-      <w:r>
-        <w:t xml:space="preserve">stays separate (it remains accessible via the</w:t>
-      </w:r>
-      <w:r>
-        <w:t xml:space="preserve"> </w:t>
-      </w:r>
-      <w:r>
         <w:rPr>
           <w:b/>
           <w:bCs/>
         </w:rPr>
+        <w:t xml:space="preserve">Zittingslijst</w:t>
+      </w:r>
+      <w:r>
+        <w:t xml:space="preserve"> </w:t>
+      </w:r>
+      <w:r>
+        <w:t xml:space="preserve">— the canonical card layout PDF.</w:t>
+      </w:r>
+    </w:p>
+    <w:p>
+      <w:pPr>
+        <w:pStyle w:val="FirstParagraph"/>
+      </w:pPr>
+      <w:r>
+        <w:t xml:space="preserve">The chosen renderer queries</w:t>
+      </w:r>
+      <w:r>
+        <w:t xml:space="preserve"> </w:t>
+      </w:r>
+      <w:r>
+        <w:rPr>
+          <w:rStyle w:val="VerbatimChar"/>
+        </w:rPr>
+        <w:t xml:space="preserve">documents</w:t>
+      </w:r>
+      <w:r>
+        <w:t xml:space="preserve"> </w:t>
+      </w:r>
+      <w:r>
+        <w:t xml:space="preserve">+</w:t>
+      </w:r>
+      <w:r>
+        <w:t xml:space="preserve"> </w:t>
+      </w:r>
+      <w:r>
+        <w:rPr>
+          <w:rStyle w:val="VerbatimChar"/>
+        </w:rPr>
+        <w:t xml:space="preserve">zaken</w:t>
+      </w:r>
+      <w:r>
+        <w:t xml:space="preserve"> </w:t>
+      </w:r>
+      <w:r>
+        <w:t xml:space="preserve">and streams a generated PDF; the source PDF in</w:t>
+      </w:r>
+      <w:r>
+        <w:t xml:space="preserve"> </w:t>
+      </w:r>
+      <w:r>
+        <w:rPr>
+          <w:rStyle w:val="VerbatimChar"/>
+        </w:rPr>
+        <w:t xml:space="preserve">documents.file_data</w:t>
+      </w:r>
+      <w:r>
+        <w:t xml:space="preserve"> </w:t>
+      </w:r>
+      <w:r>
+        <w:t xml:space="preserve">stays separate (it remains accessible via the</w:t>
+      </w:r>
+      <w:r>
+        <w:t xml:space="preserve"> </w:t>
+      </w:r>
+      <w:r>
+        <w:rPr>
+          <w:b/>
+          <w:bCs/>
+        </w:rPr>
         <w:t xml:space="preserve">Losmaken</w:t>
       </w:r>
       <w:r>
@@ -1301,12 +1035,96 @@
       </w:r>
     </w:p>
     <w:bookmarkEnd w:id="17"/>
-    <w:bookmarkStart w:id="18" w:name="audit-trail"/>
+    <w:bookmarkStart w:id="18" w:name="concurrency"/>
     <w:p>
       <w:pPr>
         <w:pStyle w:val="Heading2"/>
       </w:pPr>
       <w:r>
+        <w:t xml:space="preserve">Concurrency</w:t>
+      </w:r>
+    </w:p>
+    <w:p>
+      <w:pPr>
+        <w:pStyle w:val="FirstParagraph"/>
+      </w:pPr>
+      <w:r>
+        <w:t xml:space="preserve">A document can only be in</w:t>
+      </w:r>
+      <w:r>
+        <w:t xml:space="preserve"> </w:t>
+      </w:r>
+      <w:r>
+        <w:rPr>
+          <w:rStyle w:val="VerbatimChar"/>
+        </w:rPr>
+        <w:t xml:space="preserve">IN_BEHANDELING</w:t>
+      </w:r>
+      <w:r>
+        <w:t xml:space="preserve"> </w:t>
+      </w:r>
+      <w:r>
+        <w:t xml:space="preserve">for one Specialist at a time. While assigned to user A, user B sees the row with the assignee's name and a</w:t>
+      </w:r>
+      <w:r>
+        <w:t xml:space="preserve"> </w:t>
+      </w:r>
+      <w:r>
+        <w:rPr>
+          <w:rStyle w:val="VerbatimChar"/>
+        </w:rPr>
+        <w:t xml:space="preserve">Bezet</w:t>
+      </w:r>
+      <w:r>
+        <w:t xml:space="preserve"> </w:t>
+      </w:r>
+      <w:r>
+        <w:t xml:space="preserve">placeholder instead of the action button.</w:t>
+      </w:r>
+      <w:r>
+        <w:t xml:space="preserve"> </w:t>
+      </w:r>
+      <w:r>
+        <w:rPr>
+          <w:b/>
+          <w:bCs/>
+        </w:rPr>
+        <w:t xml:space="preserve">Opslaan en vrijgeven</w:t>
+      </w:r>
+      <w:r>
+        <w:t xml:space="preserve"> </w:t>
+      </w:r>
+      <w:r>
+        <w:t xml:space="preserve">lets A hand the document back to the queue mid-edit without losing changes; status returns to</w:t>
+      </w:r>
+      <w:r>
+        <w:t xml:space="preserve"> </w:t>
+      </w:r>
+      <w:r>
+        <w:rPr>
+          <w:rStyle w:val="VerbatimChar"/>
+        </w:rPr>
+        <w:t xml:space="preserve">NIEUW</w:t>
+      </w:r>
+      <w:r>
+        <w:t xml:space="preserve">.</w:t>
+      </w:r>
+    </w:p>
+    <w:p>
+      <w:pPr>
+        <w:pStyle w:val="BodyText"/>
+      </w:pPr>
+      <w:r>
+        <w:t xml:space="preserve">The save endpoint is otherwise lock-free — last-write-wins on each zaak. Because zaken are partitioned by document and only one Specialist can hold a document at a time, this is safe.</w:t>
+      </w:r>
+    </w:p>
+    <w:bookmarkEnd w:id="18"/>
+    <w:bookmarkStart w:id="19" w:name="audit-trail"/>
+    <w:p>
+      <w:pPr>
+        <w:pStyle w:val="Heading2"/>
+      </w:pPr>
+      <w:r>
         <w:t xml:space="preserve">Audit trail</w:t>
       </w:r>
     </w:p>
@@ -1315,7 +1133,7 @@
         <w:pStyle w:val="FirstParagraph"/>
       </w:pPr>
       <w:r>
-        <w:t xml:space="preserve">Every status transition writes an</w:t>
+        <w:t xml:space="preserve">Every state-changing call writes an</w:t>
       </w:r>
       <w:r>
         <w:t xml:space="preserve"> </w:t>
@@ -1417,7 +1235,7 @@
         <w:rPr>
           <w:rStyle w:val="VerbatimChar"/>
         </w:rPr>
-        <w:t xml:space="preserve">DOCUMENT_SUBMIT</w:t>
+        <w:t xml:space="preserve">DOCUMENT_FINALIZE</w:t>
       </w:r>
       <w:r>
         <w:t xml:space="preserve">,</w:t>
@@ -1429,7 +1247,7 @@
         <w:rPr>
           <w:rStyle w:val="VerbatimChar"/>
         </w:rPr>
-        <w:t xml:space="preserve">DOCUMENT_APPROVE</w:t>
+        <w:t xml:space="preserve">DOCUMENT_DELETE</w:t>
       </w:r>
       <w:r>
         <w:t xml:space="preserve">,</w:t>
@@ -1441,7 +1259,7 @@
         <w:rPr>
           <w:rStyle w:val="VerbatimChar"/>
         </w:rPr>
-        <w:t xml:space="preserve">DOCUMENT_REJECT</w:t>
+        <w:t xml:space="preserve">ZAAK_FIELD_CHANGE</w:t>
       </w:r>
       <w:r>
         <w:t xml:space="preserve">,</w:t>
@@ -1453,7 +1271,7 @@
         <w:rPr>
           <w:rStyle w:val="VerbatimChar"/>
         </w:rPr>
-        <w:t xml:space="preserve">ZAAK_FIELD_CHANGE</w:t>
+        <w:t xml:space="preserve">ZAAK_SAVE</w:t>
       </w:r>
       <w:r>
         <w:t xml:space="preserve">,</w:t>
@@ -1465,31 +1283,7 @@
         <w:rPr>
           <w:rStyle w:val="VerbatimChar"/>
         </w:rPr>
-        <w:t xml:space="preserve">ZAAK_SAVE</w:t>
-      </w:r>
-      <w:r>
-        <w:t xml:space="preserve">,</w:t>
-      </w:r>
-      <w:r>
-        <w:t xml:space="preserve"> </w:t>
-      </w:r>
-      <w:r>
-        <w:rPr>
-          <w:rStyle w:val="VerbatimChar"/>
-        </w:rPr>
         <w:t xml:space="preserve">ZAAK_DELETE</w:t>
-      </w:r>
-      <w:r>
-        <w:t xml:space="preserve">,</w:t>
-      </w:r>
-      <w:r>
-        <w:t xml:space="preserve"> </w:t>
-      </w:r>
-      <w:r>
-        <w:rPr>
-          <w:rStyle w:val="VerbatimChar"/>
-        </w:rPr>
-        <w:t xml:space="preserve">DOCUMENT_DELETE</w:t>
       </w:r>
     </w:p>
     <w:p>
@@ -1530,91 +1324,19 @@
         <w:t xml:space="preserve"> </w:t>
       </w:r>
       <w:r>
-        <w:t xml:space="preserve">lists the most recent entries and supports filtering by user, action, and parketnummer.</w:t>
-      </w:r>
-    </w:p>
-    <w:bookmarkEnd w:id="18"/>
-    <w:bookmarkStart w:id="19" w:name="concurrency"/>
-    <w:p>
-      <w:pPr>
-        <w:pStyle w:val="Heading2"/>
-      </w:pPr>
-      <w:r>
-        <w:t xml:space="preserve">Concurrency</w:t>
-      </w:r>
-    </w:p>
-    <w:p>
-      <w:pPr>
-        <w:pStyle w:val="FirstParagraph"/>
-      </w:pPr>
-      <w:r>
-        <w:t xml:space="preserve">A document can only be in</w:t>
-      </w:r>
-      <w:r>
-        <w:t xml:space="preserve"> </w:t>
-      </w:r>
-      <w:r>
-        <w:rPr>
-          <w:rStyle w:val="VerbatimChar"/>
-        </w:rPr>
-        <w:t xml:space="preserve">IN_BEHANDELING</w:t>
-      </w:r>
-      <w:r>
-        <w:t xml:space="preserve"> </w:t>
-      </w:r>
-      <w:r>
-        <w:t xml:space="preserve">for one Specialist at a time. While assigned to user A, user B sees the row with the assignee's name and a</w:t>
-      </w:r>
-      <w:r>
-        <w:t xml:space="preserve"> </w:t>
-      </w:r>
-      <w:r>
-        <w:rPr>
-          <w:rStyle w:val="VerbatimChar"/>
-        </w:rPr>
-        <w:t xml:space="preserve">Bezet</w:t>
-      </w:r>
-      <w:r>
-        <w:t xml:space="preserve"> </w:t>
-      </w:r>
-      <w:r>
-        <w:t xml:space="preserve">placeholder instead of the action button.</w:t>
-      </w:r>
-      <w:r>
-        <w:t xml:space="preserve"> </w:t>
-      </w:r>
-      <w:r>
-        <w:rPr>
-          <w:b/>
-          <w:bCs/>
-        </w:rPr>
-        <w:t xml:space="preserve">Opslaan en vrijgeven</w:t>
-      </w:r>
-      <w:r>
-        <w:t xml:space="preserve"> </w:t>
-      </w:r>
-      <w:r>
-        <w:t xml:space="preserve">lets A hand the document back to the queue mid-edit without losing changes; status returns to</w:t>
-      </w:r>
-      <w:r>
-        <w:t xml:space="preserve"> </w:t>
-      </w:r>
-      <w:r>
-        <w:rPr>
-          <w:rStyle w:val="VerbatimChar"/>
-        </w:rPr>
-        <w:t xml:space="preserve">NIEUW</w:t>
-      </w:r>
-      <w:r>
-        <w:t xml:space="preserve">.</w:t>
-      </w:r>
-    </w:p>
-    <w:p>
-      <w:pPr>
-        <w:pStyle w:val="BodyText"/>
-      </w:pPr>
-      <w:r>
-        <w:t xml:space="preserve">The save endpoint is otherwise lock-free — last-write-wins on each zaak. Because zaken are partitioned by document and only one Specialist can hold a document at a time, this is safe.</w:t>
+        <w:t xml:space="preserve">(linked from</w:t>
+      </w:r>
+      <w:r>
+        <w:t xml:space="preserve"> </w:t>
+      </w:r>
+      <w:r>
+        <w:rPr>
+          <w:rStyle w:val="VerbatimChar"/>
+        </w:rPr>
+        <w:t xml:space="preserve">/admin/dashboard</w:t>
+      </w:r>
+      <w:r>
+        <w:t xml:space="preserve">) lists the most recent entries and supports filtering by user, action, and kenmerk.</w:t>
       </w:r>
     </w:p>
     <w:bookmarkEnd w:id="19"/>
@@ -1954,7 +1676,34 @@
     <w:abstractNumId w:val="991"/>
   </w:num>
   <w:num w:numId="1003">
-    <w:abstractNumId w:val="991"/>
+    <w:abstractNumId w:val="99411"/>
+    <w:lvlOverride w:ilvl="0">
+      <w:startOverride w:val="1"/>
+    </w:lvlOverride>
+    <w:lvlOverride w:ilvl="1">
+      <w:startOverride w:val="1"/>
+    </w:lvlOverride>
+    <w:lvlOverride w:ilvl="2">
+      <w:startOverride w:val="1"/>
+    </w:lvlOverride>
+    <w:lvlOverride w:ilvl="3">
+      <w:startOverride w:val="1"/>
+    </w:lvlOverride>
+    <w:lvlOverride w:ilvl="4">
+      <w:startOverride w:val="1"/>
+    </w:lvlOverride>
+    <w:lvlOverride w:ilvl="5">
+      <w:startOverride w:val="1"/>
+    </w:lvlOverride>
+    <w:lvlOverride w:ilvl="6">
+      <w:startOverride w:val="1"/>
+    </w:lvlOverride>
+    <w:lvlOverride w:ilvl="7">
+      <w:startOverride w:val="1"/>
+    </w:lvlOverride>
+    <w:lvlOverride w:ilvl="8">
+      <w:startOverride w:val="1"/>
+    </w:lvlOverride>
   </w:num>
   <w:num w:numId="1004">
     <w:abstractNumId w:val="991"/>

</xml_diff>